<commit_message>
Process client clarifications: GL source (B1), dummy material (B2), configurable ACDOCA cut-over (F3)
- B1: read GL from /CCBJI/T_DME_GL; AB CO-PA GL = CB GL until separate
  account-based mapping is confirmed (GL_ACCT_ACCTBSD kept reserved)
- B2: dummy material set to 9651030000
- F3: CE2JP00->ACDOCA cut-over made configurable via TVARVC
  /CCBJI/DME_ACDOCA_FROM and CDS parameter p_cutover (test 2026001 /
  prod 2027012)
- Updated TSD and clarifications log with client responses and status

https://claude.ai/code/session_01PhKLQCUvuqS2KsuNbyxinn
</commit_message>
<xml_diff>
--- a/OPEN_QUESTIONS_DME_COPA_FC.docx
+++ b/OPEN_QUESTIONS_DME_COPA_FC.docx
@@ -2350,6 +2350,744 @@
         <w:t>Respond per row: Confirm / Clarify / Provide value. The [B] Blocking rows (B1, F1, F2, F3, T1, T2) are prerequisites — Spot-Pay production posting cannot be finalised until they are answered.</w:t>
       </w:r>
     </w:p>
+    <w:p>
+      <w:r>
+        <w:br w:type="page"/>
+      </w:r>
+    </w:p>
+    <w:p>
+      <w:pPr>
+        <w:pStyle w:val="Heading1"/>
+      </w:pPr>
+      <w:r>
+        <w:t>4. Client Responses &amp; Resolution (received 16-Jun-2026)</w:t>
+      </w:r>
+    </w:p>
+    <w:tbl>
+      <w:tblPr>
+        <w:tblStyle w:val="TableGrid"/>
+        <w:tblW w:type="auto" w:w="0"/>
+        <w:tblLook w:firstColumn="1" w:firstRow="1" w:lastColumn="0" w:lastRow="0" w:noHBand="0" w:noVBand="1" w:val="04A0"/>
+      </w:tblPr>
+      <w:tblGrid>
+        <w:gridCol w:w="2160"/>
+        <w:gridCol w:w="2160"/>
+        <w:gridCol w:w="2160"/>
+        <w:gridCol w:w="2160"/>
+      </w:tblGrid>
+      <w:tr>
+        <w:tc>
+          <w:tcPr>
+            <w:tcW w:type="dxa" w:w="720"/>
+            <w:shd w:val="clear" w:fill="1F4E79"/>
+          </w:tcPr>
+          <w:p>
+            <w:r/>
+            <w:r>
+              <w:rPr>
+                <w:b/>
+                <w:color w:val="FFFFFF"/>
+                <w:sz w:val="18"/>
+              </w:rPr>
+              <w:t>#</w:t>
+            </w:r>
+          </w:p>
+        </w:tc>
+        <w:tc>
+          <w:tcPr>
+            <w:tcW w:type="dxa" w:w="3744"/>
+            <w:shd w:val="clear" w:fill="1F4E79"/>
+          </w:tcPr>
+          <w:p>
+            <w:r/>
+            <w:r>
+              <w:rPr>
+                <w:b/>
+                <w:color w:val="FFFFFF"/>
+                <w:sz w:val="18"/>
+              </w:rPr>
+              <w:t>Client response</w:t>
+            </w:r>
+          </w:p>
+        </w:tc>
+        <w:tc>
+          <w:tcPr>
+            <w:tcW w:type="dxa" w:w="3456"/>
+            <w:shd w:val="clear" w:fill="1F4E79"/>
+          </w:tcPr>
+          <w:p>
+            <w:r/>
+            <w:r>
+              <w:rPr>
+                <w:b/>
+                <w:color w:val="FFFFFF"/>
+                <w:sz w:val="18"/>
+              </w:rPr>
+              <w:t>Dev action</w:t>
+            </w:r>
+          </w:p>
+        </w:tc>
+        <w:tc>
+          <w:tcPr>
+            <w:tcW w:type="dxa" w:w="1872"/>
+            <w:shd w:val="clear" w:fill="1F4E79"/>
+          </w:tcPr>
+          <w:p>
+            <w:r/>
+            <w:r>
+              <w:rPr>
+                <w:b/>
+                <w:color w:val="FFFFFF"/>
+                <w:sz w:val="18"/>
+              </w:rPr>
+              <w:t>Status</w:t>
+            </w:r>
+          </w:p>
+        </w:tc>
+      </w:tr>
+      <w:tr>
+        <w:tc>
+          <w:tcPr>
+            <w:tcW w:type="dxa" w:w="720"/>
+          </w:tcPr>
+          <w:p>
+            <w:r/>
+            <w:r>
+              <w:rPr>
+                <w:b w:val="0"/>
+                <w:sz w:val="18"/>
+              </w:rPr>
+              <w:t>B1</w:t>
+            </w:r>
+          </w:p>
+        </w:tc>
+        <w:tc>
+          <w:tcPr>
+            <w:tcW w:type="dxa" w:w="3744"/>
+          </w:tcPr>
+          <w:p>
+            <w:r/>
+            <w:r>
+              <w:rPr>
+                <w:b w:val="0"/>
+                <w:sz w:val="18"/>
+              </w:rPr>
+              <w:t>No separate AB GL yet. Use the same GLs maintained in /CCBJI/T_DME_GL until a separate account-based mapping is confirmed.</w:t>
+            </w:r>
+          </w:p>
+        </w:tc>
+        <w:tc>
+          <w:tcPr>
+            <w:tcW w:type="dxa" w:w="3456"/>
+          </w:tcPr>
+          <w:p>
+            <w:r/>
+            <w:r>
+              <w:rPr>
+                <w:b w:val="0"/>
+                <w:sz w:val="18"/>
+              </w:rPr>
+              <w:t>GL read switched to /CCBJI/T_DME_GL; AB GL = CB GL (SAKN1). GL_ACCT_ACCTBSD kept reserved.</w:t>
+            </w:r>
+          </w:p>
+        </w:tc>
+        <w:tc>
+          <w:tcPr>
+            <w:tcW w:type="dxa" w:w="1872"/>
+          </w:tcPr>
+          <w:p>
+            <w:r/>
+            <w:r>
+              <w:rPr>
+                <w:b/>
+                <w:color w:val="2E7D32"/>
+                <w:sz w:val="18"/>
+              </w:rPr>
+              <w:t>Implemented</w:t>
+            </w:r>
+          </w:p>
+        </w:tc>
+      </w:tr>
+      <w:tr>
+        <w:tc>
+          <w:tcPr>
+            <w:tcW w:type="dxa" w:w="720"/>
+          </w:tcPr>
+          <w:p>
+            <w:r/>
+            <w:r>
+              <w:rPr>
+                <w:b w:val="0"/>
+                <w:sz w:val="18"/>
+              </w:rPr>
+              <w:t>B2</w:t>
+            </w:r>
+          </w:p>
+        </w:tc>
+        <w:tc>
+          <w:tcPr>
+            <w:tcW w:type="dxa" w:w="3744"/>
+          </w:tcPr>
+          <w:p>
+            <w:r/>
+            <w:r>
+              <w:rPr>
+                <w:b w:val="0"/>
+                <w:sz w:val="18"/>
+              </w:rPr>
+              <w:t>Dummy material = 9651030000.</w:t>
+            </w:r>
+          </w:p>
+        </w:tc>
+        <w:tc>
+          <w:tcPr>
+            <w:tcW w:type="dxa" w:w="3456"/>
+          </w:tcPr>
+          <w:p>
+            <w:r/>
+            <w:r>
+              <w:rPr>
+                <w:b w:val="0"/>
+                <w:sz w:val="18"/>
+              </w:rPr>
+              <w:t>c_dummy_mat = 9651030000.</w:t>
+            </w:r>
+          </w:p>
+        </w:tc>
+        <w:tc>
+          <w:tcPr>
+            <w:tcW w:type="dxa" w:w="1872"/>
+          </w:tcPr>
+          <w:p>
+            <w:r/>
+            <w:r>
+              <w:rPr>
+                <w:b/>
+                <w:color w:val="2E7D32"/>
+                <w:sz w:val="18"/>
+              </w:rPr>
+              <w:t>Implemented</w:t>
+            </w:r>
+          </w:p>
+        </w:tc>
+      </w:tr>
+      <w:tr>
+        <w:tc>
+          <w:tcPr>
+            <w:tcW w:type="dxa" w:w="720"/>
+          </w:tcPr>
+          <w:p>
+            <w:r/>
+            <w:r>
+              <w:rPr>
+                <w:b w:val="0"/>
+                <w:sz w:val="18"/>
+              </w:rPr>
+              <w:t>B3</w:t>
+            </w:r>
+          </w:p>
+        </w:tc>
+        <w:tc>
+          <w:tcPr>
+            <w:tcW w:type="dxa" w:w="3744"/>
+          </w:tcPr>
+          <w:p>
+            <w:r/>
+            <w:r>
+              <w:rPr>
+                <w:b w:val="0"/>
+                <w:sz w:val="18"/>
+              </w:rPr>
+              <w:t>In scope - test case 5000442076.</w:t>
+            </w:r>
+          </w:p>
+        </w:tc>
+        <w:tc>
+          <w:tcPr>
+            <w:tcW w:type="dxa" w:w="3456"/>
+          </w:tcPr>
+          <w:p>
+            <w:r/>
+            <w:r>
+              <w:rPr>
+                <w:b w:val="0"/>
+                <w:sz w:val="18"/>
+              </w:rPr>
+              <w:t>Cross-territory / cross-company logged for Phase-1 parity build.</w:t>
+            </w:r>
+          </w:p>
+        </w:tc>
+        <w:tc>
+          <w:tcPr>
+            <w:tcW w:type="dxa" w:w="1872"/>
+          </w:tcPr>
+          <w:p>
+            <w:r/>
+            <w:r>
+              <w:rPr>
+                <w:b/>
+                <w:color w:val="B26A00"/>
+                <w:sz w:val="18"/>
+              </w:rPr>
+              <w:t>Backlog</w:t>
+            </w:r>
+          </w:p>
+        </w:tc>
+      </w:tr>
+      <w:tr>
+        <w:tc>
+          <w:tcPr>
+            <w:tcW w:type="dxa" w:w="720"/>
+          </w:tcPr>
+          <w:p>
+            <w:r/>
+            <w:r>
+              <w:rPr>
+                <w:b w:val="0"/>
+                <w:sz w:val="18"/>
+              </w:rPr>
+              <w:t>F1</w:t>
+            </w:r>
+          </w:p>
+        </w:tc>
+        <w:tc>
+          <w:tcPr>
+            <w:tcW w:type="dxa" w:w="3744"/>
+          </w:tcPr>
+          <w:p>
+            <w:r/>
+            <w:r>
+              <w:rPr>
+                <w:b w:val="0"/>
+                <w:sz w:val="18"/>
+              </w:rPr>
+              <w:t>Assume single BAPI call posts both CB + AB; must be validated in sandbox with CO (test cases shared).</w:t>
+            </w:r>
+          </w:p>
+        </w:tc>
+        <w:tc>
+          <w:tcPr>
+            <w:tcW w:type="dxa" w:w="3456"/>
+          </w:tcPr>
+          <w:p>
+            <w:r/>
+            <w:r>
+              <w:rPr>
+                <w:b w:val="0"/>
+                <w:sz w:val="18"/>
+              </w:rPr>
+              <w:t>Design retained.</w:t>
+            </w:r>
+          </w:p>
+        </w:tc>
+        <w:tc>
+          <w:tcPr>
+            <w:tcW w:type="dxa" w:w="1872"/>
+          </w:tcPr>
+          <w:p>
+            <w:r/>
+            <w:r>
+              <w:rPr>
+                <w:b/>
+                <w:color w:val="B26A00"/>
+                <w:sz w:val="18"/>
+              </w:rPr>
+              <w:t>Coded - pending sandbox</w:t>
+            </w:r>
+          </w:p>
+        </w:tc>
+      </w:tr>
+      <w:tr>
+        <w:tc>
+          <w:tcPr>
+            <w:tcW w:type="dxa" w:w="720"/>
+          </w:tcPr>
+          <w:p>
+            <w:r/>
+            <w:r>
+              <w:rPr>
+                <w:b w:val="0"/>
+                <w:sz w:val="18"/>
+              </w:rPr>
+              <w:t>F2</w:t>
+            </w:r>
+          </w:p>
+        </w:tc>
+        <w:tc>
+          <w:tcPr>
+            <w:tcW w:type="dxa" w:w="3744"/>
+          </w:tcPr>
+          <w:p>
+            <w:r/>
+            <w:r>
+              <w:rPr>
+                <w:b w:val="0"/>
+                <w:sz w:val="18"/>
+              </w:rPr>
+              <w:t>Assume AS-IS; custom chars expected available. To be confirmed by Gaurav-san.</w:t>
+            </w:r>
+          </w:p>
+        </w:tc>
+        <w:tc>
+          <w:tcPr>
+            <w:tcW w:type="dxa" w:w="3456"/>
+          </w:tcPr>
+          <w:p>
+            <w:r/>
+            <w:r>
+              <w:rPr>
+                <w:b w:val="0"/>
+                <w:sz w:val="18"/>
+              </w:rPr>
+              <w:t>CRITERIA passes VKAUS/WW228/WW229/KUNWE.</w:t>
+            </w:r>
+          </w:p>
+        </w:tc>
+        <w:tc>
+          <w:tcPr>
+            <w:tcW w:type="dxa" w:w="1872"/>
+          </w:tcPr>
+          <w:p>
+            <w:r/>
+            <w:r>
+              <w:rPr>
+                <w:b/>
+                <w:color w:val="B26A00"/>
+                <w:sz w:val="18"/>
+              </w:rPr>
+              <w:t>Coded - pending confirm</w:t>
+            </w:r>
+          </w:p>
+        </w:tc>
+      </w:tr>
+      <w:tr>
+        <w:tc>
+          <w:tcPr>
+            <w:tcW w:type="dxa" w:w="720"/>
+          </w:tcPr>
+          <w:p>
+            <w:r/>
+            <w:r>
+              <w:rPr>
+                <w:b w:val="0"/>
+                <w:sz w:val="18"/>
+              </w:rPr>
+              <w:t>F3</w:t>
+            </w:r>
+          </w:p>
+        </w:tc>
+        <w:tc>
+          <w:tcPr>
+            <w:tcW w:type="dxa" w:w="3744"/>
+          </w:tcPr>
+          <w:p>
+            <w:r/>
+            <w:r>
+              <w:rPr>
+                <w:b w:val="0"/>
+                <w:sz w:val="18"/>
+              </w:rPr>
+              <w:t>Testing: ACDOCA from Jan-2026. Production: CE2JP00 till Nov-2027, ACDOCA from Dec-2027.</w:t>
+            </w:r>
+          </w:p>
+        </w:tc>
+        <w:tc>
+          <w:tcPr>
+            <w:tcW w:type="dxa" w:w="3456"/>
+          </w:tcPr>
+          <w:p>
+            <w:r/>
+            <w:r>
+              <w:rPr>
+                <w:b w:val="0"/>
+                <w:sz w:val="18"/>
+              </w:rPr>
+              <w:t>Cut-over made configurable: TVARVC /CCBJI/DME_ACDOCA_FROM -&gt; CDS parameter p_cutover.</w:t>
+            </w:r>
+          </w:p>
+        </w:tc>
+        <w:tc>
+          <w:tcPr>
+            <w:tcW w:type="dxa" w:w="1872"/>
+          </w:tcPr>
+          <w:p>
+            <w:r/>
+            <w:r>
+              <w:rPr>
+                <w:b/>
+                <w:color w:val="2E7D32"/>
+                <w:sz w:val="18"/>
+              </w:rPr>
+              <w:t>Implemented</w:t>
+            </w:r>
+          </w:p>
+        </w:tc>
+      </w:tr>
+      <w:tr>
+        <w:tc>
+          <w:tcPr>
+            <w:tcW w:type="dxa" w:w="720"/>
+          </w:tcPr>
+          <w:p>
+            <w:r/>
+            <w:r>
+              <w:rPr>
+                <w:b w:val="0"/>
+                <w:sz w:val="18"/>
+              </w:rPr>
+              <w:t>F4-F11</w:t>
+            </w:r>
+          </w:p>
+        </w:tc>
+        <w:tc>
+          <w:tcPr>
+            <w:tcW w:type="dxa" w:w="3744"/>
+          </w:tcPr>
+          <w:p>
+            <w:r/>
+            <w:r>
+              <w:rPr>
+                <w:b w:val="0"/>
+                <w:sz w:val="18"/>
+              </w:rPr>
+              <w:t>Not yet answered.</w:t>
+            </w:r>
+          </w:p>
+        </w:tc>
+        <w:tc>
+          <w:tcPr>
+            <w:tcW w:type="dxa" w:w="3456"/>
+          </w:tcPr>
+          <w:p>
+            <w:r/>
+            <w:r>
+              <w:rPr>
+                <w:b w:val="0"/>
+                <w:sz w:val="18"/>
+              </w:rPr>
+              <w:t>Current assumptions retained.</w:t>
+            </w:r>
+          </w:p>
+        </w:tc>
+        <w:tc>
+          <w:tcPr>
+            <w:tcW w:type="dxa" w:w="1872"/>
+          </w:tcPr>
+          <w:p>
+            <w:r/>
+            <w:r>
+              <w:rPr>
+                <w:b/>
+                <w:color w:val="9E9E9E"/>
+                <w:sz w:val="18"/>
+              </w:rPr>
+              <w:t>Open</w:t>
+            </w:r>
+          </w:p>
+        </w:tc>
+      </w:tr>
+      <w:tr>
+        <w:tc>
+          <w:tcPr>
+            <w:tcW w:type="dxa" w:w="720"/>
+          </w:tcPr>
+          <w:p>
+            <w:r/>
+            <w:r>
+              <w:rPr>
+                <w:b w:val="0"/>
+                <w:sz w:val="18"/>
+              </w:rPr>
+              <w:t>T1</w:t>
+            </w:r>
+          </w:p>
+        </w:tc>
+        <w:tc>
+          <w:tcPr>
+            <w:tcW w:type="dxa" w:w="3744"/>
+          </w:tcPr>
+          <w:p>
+            <w:r/>
+            <w:r>
+              <w:rPr>
+                <w:b w:val="0"/>
+                <w:sz w:val="18"/>
+              </w:rPr>
+              <w:t>WCOCOH append field names to be confirmed with Pankaj-san.</w:t>
+            </w:r>
+          </w:p>
+        </w:tc>
+        <w:tc>
+          <w:tcPr>
+            <w:tcW w:type="dxa" w:w="3456"/>
+          </w:tcPr>
+          <w:p>
+            <w:r/>
+            <w:r>
+              <w:rPr>
+                <w:b w:val="0"/>
+                <w:sz w:val="18"/>
+              </w:rPr>
+              <w:t>Placeholders ZZBOTACC / CUST_OWNER retained.</w:t>
+            </w:r>
+          </w:p>
+        </w:tc>
+        <w:tc>
+          <w:tcPr>
+            <w:tcW w:type="dxa" w:w="1872"/>
+          </w:tcPr>
+          <w:p>
+            <w:r/>
+            <w:r>
+              <w:rPr>
+                <w:b/>
+                <w:color w:val="B26A00"/>
+                <w:sz w:val="18"/>
+              </w:rPr>
+              <w:t>Pending</w:t>
+            </w:r>
+          </w:p>
+        </w:tc>
+      </w:tr>
+      <w:tr>
+        <w:tc>
+          <w:tcPr>
+            <w:tcW w:type="dxa" w:w="720"/>
+          </w:tcPr>
+          <w:p>
+            <w:r/>
+            <w:r>
+              <w:rPr>
+                <w:b w:val="0"/>
+                <w:sz w:val="18"/>
+              </w:rPr>
+              <w:t>T2</w:t>
+            </w:r>
+          </w:p>
+        </w:tc>
+        <w:tc>
+          <w:tcPr>
+            <w:tcW w:type="dxa" w:w="3744"/>
+          </w:tcPr>
+          <w:p>
+            <w:r/>
+            <w:r>
+              <w:rPr>
+                <w:b w:val="0"/>
+                <w:sz w:val="18"/>
+              </w:rPr>
+              <w:t>Assume CI_ACDOCA field names unchanged; confirm with Gaurav-san.</w:t>
+            </w:r>
+          </w:p>
+        </w:tc>
+        <w:tc>
+          <w:tcPr>
+            <w:tcW w:type="dxa" w:w="3456"/>
+          </w:tcPr>
+          <w:p>
+            <w:r/>
+            <w:r>
+              <w:rPr>
+                <w:b w:val="0"/>
+                <w:sz w:val="18"/>
+              </w:rPr>
+              <w:t>Placeholders retained in CDS.</w:t>
+            </w:r>
+          </w:p>
+        </w:tc>
+        <w:tc>
+          <w:tcPr>
+            <w:tcW w:type="dxa" w:w="1872"/>
+          </w:tcPr>
+          <w:p>
+            <w:r/>
+            <w:r>
+              <w:rPr>
+                <w:b/>
+                <w:color w:val="B26A00"/>
+                <w:sz w:val="18"/>
+              </w:rPr>
+              <w:t>Pending</w:t>
+            </w:r>
+          </w:p>
+        </w:tc>
+      </w:tr>
+      <w:tr>
+        <w:tc>
+          <w:tcPr>
+            <w:tcW w:type="dxa" w:w="720"/>
+          </w:tcPr>
+          <w:p>
+            <w:r/>
+            <w:r>
+              <w:rPr>
+                <w:b w:val="0"/>
+                <w:sz w:val="18"/>
+              </w:rPr>
+              <w:t>T3-T7</w:t>
+            </w:r>
+          </w:p>
+        </w:tc>
+        <w:tc>
+          <w:tcPr>
+            <w:tcW w:type="dxa" w:w="3744"/>
+          </w:tcPr>
+          <w:p>
+            <w:r/>
+            <w:r>
+              <w:rPr>
+                <w:b w:val="0"/>
+                <w:sz w:val="18"/>
+              </w:rPr>
+              <w:t>Not yet answered.</w:t>
+            </w:r>
+          </w:p>
+        </w:tc>
+        <w:tc>
+          <w:tcPr>
+            <w:tcW w:type="dxa" w:w="3456"/>
+          </w:tcPr>
+          <w:p>
+            <w:r/>
+            <w:r>
+              <w:rPr>
+                <w:b w:val="0"/>
+                <w:sz w:val="18"/>
+              </w:rPr>
+              <w:t>Current assumptions retained.</w:t>
+            </w:r>
+          </w:p>
+        </w:tc>
+        <w:tc>
+          <w:tcPr>
+            <w:tcW w:type="dxa" w:w="1872"/>
+          </w:tcPr>
+          <w:p>
+            <w:r/>
+            <w:r>
+              <w:rPr>
+                <w:b/>
+                <w:color w:val="9E9E9E"/>
+                <w:sz w:val="18"/>
+              </w:rPr>
+              <w:t>Open</w:t>
+            </w:r>
+          </w:p>
+        </w:tc>
+      </w:tr>
+    </w:tbl>
+    <w:p/>
+    <w:p>
+      <w:r>
+        <w:rPr>
+          <w:b/>
+        </w:rPr>
+        <w:t xml:space="preserve">Remaining blockers before production posting: </w:t>
+      </w:r>
+      <w:r>
+        <w:t>F1 sandbox validation (CO), F2 + T2 (Gaurav-san), T1 (Pankaj-san).</w:t>
+      </w:r>
+    </w:p>
     <w:sectPr>
       <w:pgSz w:w="12240" w:h="15840"/>
       <w:pgMar w:top="1440" w:right="1800" w:bottom="1440" w:left="1800" w:header="720" w:footer="720" w:gutter="0"/>

</xml_diff>

<commit_message>
Process customer/functional round-2 updates: F2 & T2 confirmed, F3 clarified
- F2 confirmed: custom characteristics remain AS-IS, available & passable
- T2 confirmed: all characteristics present in account-based CO-PA (ACDOCA)
- F3 clarified: both CB+AB CO-PA active from 2026; sales-source cut-over
  kept configurable
- T1 (WCOCOH append names) is now the only remaining activation blocker
- Updated program/CDS comments, TSD, clarifications log (+docx), readiness checklist

https://claude.ai/code/session_01PhKLQCUvuqS2KsuNbyxinn
</commit_message>
<xml_diff>
--- a/OPEN_QUESTIONS_DME_COPA_FC.docx
+++ b/OPEN_QUESTIONS_DME_COPA_FC.docx
@@ -2360,7 +2360,7 @@
         <w:pStyle w:val="Heading1"/>
       </w:pPr>
       <w:r>
-        <w:t>4. Client Responses &amp; Resolution (received 16-Jun-2026)</w:t>
+        <w:t>4. Client Responses &amp; Resolution (updated 16-Jun-2026, round 2)</w:t>
       </w:r>
     </w:p>
     <w:tbl>
@@ -2613,7 +2613,7 @@
                 <w:b w:val="0"/>
                 <w:sz w:val="18"/>
               </w:rPr>
-              <w:t>Cross-territory / cross-company logged for Phase-1 parity build.</w:t>
+              <w:t>Cross-territory core: company range (main+sub), per-company dummy lines, cost-centre split. Customer include/exclude split (F7) backlog.</w:t>
             </w:r>
           </w:p>
         </w:tc>
@@ -2626,10 +2626,10 @@
             <w:r>
               <w:rPr>
                 <w:b/>
-                <w:color w:val="B26A00"/>
+                <w:color w:val="2E7D32"/>
                 <w:sz w:val="18"/>
               </w:rPr>
-              <w:t>Backlog</w:t>
+              <w:t>Core coded</w:t>
             </w:r>
           </w:p>
         </w:tc>
@@ -2724,7 +2724,7 @@
                 <w:b w:val="0"/>
                 <w:sz w:val="18"/>
               </w:rPr>
-              <w:t>Assume AS-IS; custom chars expected available. To be confirmed by Gaurav-san.</w:t>
+              <w:t>CONFIRMED - all characteristics remain AS-IS; VKAUS/WW228/WW229/KUNWE available and passable.</w:t>
             </w:r>
           </w:p>
         </w:tc>
@@ -2739,7 +2739,7 @@
                 <w:b w:val="0"/>
                 <w:sz w:val="18"/>
               </w:rPr>
-              <w:t>CRITERIA passes VKAUS/WW228/WW229/KUNWE.</w:t>
+              <w:t>CRITERIA passes them.</w:t>
             </w:r>
           </w:p>
         </w:tc>
@@ -2752,10 +2752,10 @@
             <w:r>
               <w:rPr>
                 <w:b/>
-                <w:color w:val="B26A00"/>
+                <w:color w:val="2E7D32"/>
                 <w:sz w:val="18"/>
               </w:rPr>
-              <w:t>Coded - pending confirm</w:t>
+              <w:t>Confirmed</w:t>
             </w:r>
           </w:p>
         </w:tc>
@@ -2787,7 +2787,7 @@
                 <w:b w:val="0"/>
                 <w:sz w:val="18"/>
               </w:rPr>
-              <w:t>Testing: ACDOCA from Jan-2026. Production: CE2JP00 till Nov-2027, ACDOCA from Dec-2027.</w:t>
+              <w:t>Both Costing and Account-Based CO-PA active in Year 2026. Sales-source CE2-&gt;ACDOCA read cut-over independent.</w:t>
             </w:r>
           </w:p>
         </w:tc>
@@ -2802,7 +2802,7 @@
                 <w:b w:val="0"/>
                 <w:sz w:val="18"/>
               </w:rPr>
-              <w:t>Cut-over made configurable: TVARVC /CCBJI/DME_ACDOCA_FROM -&gt; CDS parameter p_cutover.</w:t>
+              <w:t>Dual posting applies 2026+; sales-source cut-over configurable (TVARVC -&gt; CDS p_cutover).</w:t>
             </w:r>
           </w:p>
         </w:tc>
@@ -2913,7 +2913,7 @@
                 <w:b w:val="0"/>
                 <w:sz w:val="18"/>
               </w:rPr>
-              <w:t>WCOCOH append field names to be confirmed with Pankaj-san.</w:t>
+              <w:t>WCOCOH append field names still to be confirmed with Pankaj-san.</w:t>
             </w:r>
           </w:p>
         </w:tc>
@@ -2944,7 +2944,7 @@
                 <w:color w:val="B26A00"/>
                 <w:sz w:val="18"/>
               </w:rPr>
-              <w:t>Pending</w:t>
+              <w:t>Pending - only activation blocker</w:t>
             </w:r>
           </w:p>
         </w:tc>
@@ -2976,7 +2976,7 @@
                 <w:b w:val="0"/>
                 <w:sz w:val="18"/>
               </w:rPr>
-              <w:t>Assume CI_ACDOCA field names unchanged; confirm with Gaurav-san.</w:t>
+              <w:t>CONFIRMED - all characteristics are in account-based CO-PA (ACDOCA).</w:t>
             </w:r>
           </w:p>
         </w:tc>
@@ -2991,7 +2991,7 @@
                 <w:b w:val="0"/>
                 <w:sz w:val="18"/>
               </w:rPr>
-              <w:t>Placeholders retained in CDS.</w:t>
+              <w:t>CDS ACDOCA field names validated; no change.</w:t>
             </w:r>
           </w:p>
         </w:tc>
@@ -3004,10 +3004,10 @@
             <w:r>
               <w:rPr>
                 <w:b/>
-                <w:color w:val="B26A00"/>
+                <w:color w:val="2E7D32"/>
                 <w:sz w:val="18"/>
               </w:rPr>
-              <w:t>Pending</w:t>
+              <w:t>Confirmed</w:t>
             </w:r>
           </w:p>
         </w:tc>
@@ -3085,7 +3085,7 @@
         <w:t xml:space="preserve">Remaining blockers before production posting: </w:t>
       </w:r>
       <w:r>
-        <w:t>F1 sandbox validation (CO), F2 + T2 (Gaurav-san), T1 (Pankaj-san).</w:t>
+        <w:t>Activation: T1 (WCOCOH names, Pankaj-san). Production posting: F1 sandbox validation (CO).</w:t>
       </w:r>
     </w:p>
     <w:sectPr>

</xml_diff>